<commit_message>
Round A revisions (review files only): accurate description of the case source (18 cases, 2 two-turn conversations, 20 turn judgments); neutral IDs R01–R18 in a fixed shuffled order with supplement cases mixed in (internal mapping in review/internal/, not sent); blind library with ID, source, location and verbatim text only. Round B, system, gold and results unchanged.
Co-Authored-By: Claude Opus 5.5 <noreply@anthropic.com>
Claude-Session: https://claude.ai/code/session_01RkXtRf8o9rcFbV2XzFoBFz
</commit_message>
<xml_diff>
--- a/review/daleel-v1.0-roundA-blind-review.docx
+++ b/review/daleel-v1.0-roundA-blind-review.docx
@@ -41,7 +41,7 @@
         <w:rPr>
           <w:rtl/>
         </w:rPr>
-        <w:t xml:space="preserve">في هذا الملف 18 سؤالاً كتبها مستخدمون مبتدئون عن القرآن الكريم، كما وردت حرفياً.</w:t>
+        <w:t xml:space="preserve">في هذا الملف 18 حالة بصياغة طبيعية تمثل أسئلة مبتدئين عن القرآن، أُعدّت استقلالياً قبل تشغيل النسخة المقاسة.</w:t>
       </w:r>
     </w:p>
     <w:p>
@@ -57,20 +57,7 @@
         <w:rPr>
           <w:rtl/>
         </w:rPr>
-        <w:t xml:space="preserve">المرفق مع هذا الملف هو المكتبة الكاملة v25 (</w:t>
-      </w:r>
-      <w:r>
-        <w:rPr>
-          <w:rStyle w:val="VerbatimChar"/>
-          <w:rtl/>
-        </w:rPr>
-        <w:t xml:space="preserve">daleel-library-v25-frozen-for-heldout.xlsx</w:t>
-      </w:r>
-      <w:r>
-        <w:rPr>
-          <w:rtl/>
-        </w:rPr>
-        <w:t xml:space="preserve">)، وفيها 34 مقتطفاً معتمداً. لكل مقتطف: نصه الحرفي، ومصدره وموضعه، وما يجيب عنه، وحدود دليله، وما لا يجيب عنه، والأسئلة القريبة التي لا يجيب عنها، ومتى يُحال.</w:t>
+        <w:t xml:space="preserve">من الحالات الثماني عشرة محادثتان من دورين (سؤال أول، ثم متابعة يكتبها المستخدم بعده)، فمجموع الأحكام المطلوبة 20 حكماً: حكم لكل دور. احكم على كل دور منفصلاً.</w:t>
       </w:r>
     </w:p>
     <w:p>
@@ -86,27 +73,20 @@
         <w:rPr>
           <w:rtl/>
         </w:rPr>
-        <w:t xml:space="preserve">لكل سؤال: احكم بما ينبغي أن يكون الرد الصحيح</w:t>
-      </w:r>
-      <w:r>
-        <w:rPr>
-          <w:rtl/>
-        </w:rPr>
-        <w:t xml:space="preserve"> </w:t>
-      </w:r>
-      <w:r>
-        <w:rPr>
-          <w:rtl/>
-          <w:bCs/>
-          <w:b/>
-        </w:rPr>
-        <w:t xml:space="preserve">من هذه المكتبة وحدها</w:t>
-      </w:r>
-      <w:r>
-        <w:rPr>
-          <w:rtl/>
-        </w:rPr>
-        <w:t xml:space="preserve">، دون مصادر خارجية، واملأ نموذج الإجابة.</w:t>
+        <w:t xml:space="preserve">المرفق مع هذا الملف هو المكتبة الكاملة (</w:t>
+      </w:r>
+      <w:r>
+        <w:rPr>
+          <w:rStyle w:val="VerbatimChar"/>
+          <w:rtl/>
+        </w:rPr>
+        <w:t xml:space="preserve">daleel-library-v25-blind-review.xlsx</w:t>
+      </w:r>
+      <w:r>
+        <w:rPr>
+          <w:rtl/>
+        </w:rPr>
+        <w:t xml:space="preserve">)، وفيها 34 مقتطفاً معتمداً. لكل مقتطف: رقمه، ومصدره، وموضعه المرجعي، ونصه الحرفي.</w:t>
       </w:r>
     </w:p>
     <w:p>
@@ -122,7 +102,27 @@
         <w:rPr>
           <w:rtl/>
         </w:rPr>
-        <w:t xml:space="preserve">سؤالا H11 وH12 محادثتان من دورين: سؤال أول، ثم متابعة يكتبها المستخدم بعده. احكم على كل دور منفصلاً.</w:t>
+        <w:t xml:space="preserve">لكل حالة: احكم بما ينبغي أن يكون الرد الصحيح</w:t>
+      </w:r>
+      <w:r>
+        <w:rPr>
+          <w:rtl/>
+        </w:rPr>
+        <w:t xml:space="preserve"> </w:t>
+      </w:r>
+      <w:r>
+        <w:rPr>
+          <w:rtl/>
+          <w:bCs/>
+          <w:b/>
+        </w:rPr>
+        <w:t xml:space="preserve">من هذه المكتبة وحدها</w:t>
+      </w:r>
+      <w:r>
+        <w:rPr>
+          <w:rtl/>
+        </w:rPr>
+        <w:t xml:space="preserve">، دون مصادر خارجية، واملأ نموذج الإجابة.</w:t>
       </w:r>
     </w:p>
     <w:p>
@@ -549,7 +549,7 @@
       </w:r>
     </w:p>
     <w:bookmarkEnd w:id="21"/>
-    <w:bookmarkStart w:id="40" w:name="الأسئلة-ونموذج-الإجابة"/>
+    <w:bookmarkStart w:id="40" w:name="الحالات-ونموذج-الإجابة"/>
     <w:p>
       <w:pPr>
         <w:pStyle w:val="Heading2"/>
@@ -559,10 +559,10 @@
         <w:rPr>
           <w:rtl/>
         </w:rPr>
-        <w:t xml:space="preserve">الأسئلة ونموذج الإجابة</w:t>
+        <w:t xml:space="preserve">الحالات ونموذج الإجابة</w:t>
       </w:r>
     </w:p>
-    <w:bookmarkStart w:id="22" w:name="h01"/>
+    <w:bookmarkStart w:id="22" w:name="r01"/>
     <w:p>
       <w:pPr>
         <w:pStyle w:val="Heading3"/>
@@ -572,7 +572,7 @@
         <w:rPr>
           <w:rtl/>
         </w:rPr>
-        <w:t xml:space="preserve">H01</w:t>
+        <w:t xml:space="preserve">R01</w:t>
       </w:r>
     </w:p>
     <w:p>
@@ -597,7 +597,7 @@
         <w:rPr>
           <w:rtl/>
         </w:rPr>
-        <w:t xml:space="preserve">ما المقصود بقوله تعالى:</w:t>
+        <w:t xml:space="preserve">هل الآية التي تقول</w:t>
       </w:r>
       <w:r>
         <w:rPr>
@@ -615,7 +615,7 @@
         <w:rPr>
           <w:rtl/>
         </w:rPr>
-        <w:t xml:space="preserve">اهدِنَا الصِّرَاطَ المُستَقِيمَ</w:t>
+        <w:t xml:space="preserve">لا إكراه في الدين</w:t>
       </w:r>
       <w:r>
         <w:rPr>
@@ -627,7 +627,13 @@
         <w:rPr>
           <w:rtl/>
         </w:rPr>
-        <w:t xml:space="preserve">؟</w:t>
+        <w:t xml:space="preserve"> </w:t>
+      </w:r>
+      <w:r>
+        <w:rPr>
+          <w:rtl/>
+        </w:rPr>
+        <w:t xml:space="preserve">تتكلم عن دخول الإسلام فقط، أم عن التعامل مع غير المسلمين بشكل عام؟</w:t>
       </w:r>
     </w:p>
     <w:tbl>
@@ -915,7 +921,7 @@
       </w:tr>
     </w:tbl>
     <w:bookmarkEnd w:id="22"/>
-    <w:bookmarkStart w:id="23" w:name="h02"/>
+    <w:bookmarkStart w:id="23" w:name="r02"/>
     <w:p>
       <w:pPr>
         <w:pStyle w:val="Heading3"/>
@@ -925,7 +931,7 @@
         <w:rPr>
           <w:rtl/>
         </w:rPr>
-        <w:t xml:space="preserve">H02</w:t>
+        <w:t xml:space="preserve">R02</w:t>
       </w:r>
     </w:p>
     <w:p>
@@ -950,7 +956,7 @@
         <w:rPr>
           <w:rtl/>
         </w:rPr>
-        <w:t xml:space="preserve">لماذا توجد سور مكية وسور مدنية في القرآن؟ وما الفرق بينهما؟</w:t>
+        <w:t xml:space="preserve">هل توجد طريقة للتحقق من صحة حديث يُقال إنه يفسر آية معينة، أم أن هذا موضوع مختلف عن القرآن؟</w:t>
       </w:r>
     </w:p>
     <w:tbl>
@@ -1238,7 +1244,7 @@
       </w:tr>
     </w:tbl>
     <w:bookmarkEnd w:id="23"/>
-    <w:bookmarkStart w:id="24" w:name="h03"/>
+    <w:bookmarkStart w:id="24" w:name="r03"/>
     <w:p>
       <w:pPr>
         <w:pStyle w:val="Heading3"/>
@@ -1248,7 +1254,7 @@
         <w:rPr>
           <w:rtl/>
         </w:rPr>
-        <w:t xml:space="preserve">H03</w:t>
+        <w:t xml:space="preserve">R03</w:t>
       </w:r>
     </w:p>
     <w:p>
@@ -1273,7 +1279,7 @@
         <w:rPr>
           <w:rtl/>
         </w:rPr>
-        <w:t xml:space="preserve">ماذا يقول القرآن عن كيفية التعامل مع الوالدين حتى لو كانوا غير مسلمين؟</w:t>
+        <w:t xml:space="preserve">أنا أحاول ألتزم بقراءة القرآن يوميًا، لكن فاتتني قراءتي عدة أيام، فهل عليّ شيء شرعًا؟ وكيف أعوضها؟</w:t>
       </w:r>
     </w:p>
     <w:tbl>
@@ -1561,7 +1567,7 @@
       </w:tr>
     </w:tbl>
     <w:bookmarkEnd w:id="24"/>
-    <w:bookmarkStart w:id="25" w:name="h04"/>
+    <w:bookmarkStart w:id="25" w:name="r04"/>
     <w:p>
       <w:pPr>
         <w:pStyle w:val="Heading3"/>
@@ -1571,7 +1577,7 @@
         <w:rPr>
           <w:rtl/>
         </w:rPr>
-        <w:t xml:space="preserve">H04</w:t>
+        <w:t xml:space="preserve">R04</w:t>
       </w:r>
     </w:p>
     <w:p>
@@ -1596,7 +1602,43 @@
         <w:rPr>
           <w:rtl/>
         </w:rPr>
-        <w:t xml:space="preserve">ما معنى التقوى في القرآن؟ هل هي مجرد الخوف من الله؟</w:t>
+        <w:t xml:space="preserve">ما معنى كلمة</w:t>
+      </w:r>
+      <w:r>
+        <w:rPr>
+          <w:rtl/>
+        </w:rPr>
+        <w:t xml:space="preserve"> </w:t>
+      </w:r>
+      <w:r>
+        <w:rPr>
+          <w:rtl/>
+        </w:rPr>
+        <w:t xml:space="preserve">“</w:t>
+      </w:r>
+      <w:r>
+        <w:rPr>
+          <w:rtl/>
+        </w:rPr>
+        <w:t xml:space="preserve">آية</w:t>
+      </w:r>
+      <w:r>
+        <w:rPr>
+          <w:rtl/>
+        </w:rPr>
+        <w:t xml:space="preserve">”</w:t>
+      </w:r>
+      <w:r>
+        <w:rPr>
+          <w:rtl/>
+        </w:rPr>
+        <w:t xml:space="preserve"> </w:t>
+      </w:r>
+      <w:r>
+        <w:rPr>
+          <w:rtl/>
+        </w:rPr>
+        <w:t xml:space="preserve">في القرآن؟</w:t>
       </w:r>
     </w:p>
     <w:tbl>
@@ -1884,7 +1926,7 @@
       </w:tr>
     </w:tbl>
     <w:bookmarkEnd w:id="25"/>
-    <w:bookmarkStart w:id="26" w:name="h05"/>
+    <w:bookmarkStart w:id="26" w:name="r05"/>
     <w:p>
       <w:pPr>
         <w:pStyle w:val="Heading3"/>
@@ -1894,7 +1936,7 @@
         <w:rPr>
           <w:rtl/>
         </w:rPr>
-        <w:t xml:space="preserve">H05</w:t>
+        <w:t xml:space="preserve">R05</w:t>
       </w:r>
     </w:p>
     <w:p>
@@ -1919,7 +1961,7 @@
         <w:rPr>
           <w:rtl/>
         </w:rPr>
-        <w:t xml:space="preserve">أريد أن أفهم قصة أصحاب الكهف ببساطة: ماذا حدث لهم ولماذا ذكرهم القرآن؟</w:t>
+        <w:t xml:space="preserve">لماذا توجد سور مكية وسور مدنية في القرآن؟ وما الفرق بينهما؟</w:t>
       </w:r>
     </w:p>
     <w:tbl>
@@ -2207,7 +2249,7 @@
       </w:tr>
     </w:tbl>
     <w:bookmarkEnd w:id="26"/>
-    <w:bookmarkStart w:id="27" w:name="h06"/>
+    <w:bookmarkStart w:id="27" w:name="r06"/>
     <w:p>
       <w:pPr>
         <w:pStyle w:val="Heading3"/>
@@ -2217,7 +2259,7 @@
         <w:rPr>
           <w:rtl/>
         </w:rPr>
-        <w:t xml:space="preserve">H06</w:t>
+        <w:t xml:space="preserve">R06</w:t>
       </w:r>
     </w:p>
     <w:p>
@@ -2242,43 +2284,7 @@
         <w:rPr>
           <w:rtl/>
         </w:rPr>
-        <w:t xml:space="preserve">ما معنى كلمة</w:t>
-      </w:r>
-      <w:r>
-        <w:rPr>
-          <w:rtl/>
-        </w:rPr>
-        <w:t xml:space="preserve"> </w:t>
-      </w:r>
-      <w:r>
-        <w:rPr>
-          <w:rtl/>
-        </w:rPr>
-        <w:t xml:space="preserve">“</w:t>
-      </w:r>
-      <w:r>
-        <w:rPr>
-          <w:rtl/>
-        </w:rPr>
-        <w:t xml:space="preserve">آية</w:t>
-      </w:r>
-      <w:r>
-        <w:rPr>
-          <w:rtl/>
-        </w:rPr>
-        <w:t xml:space="preserve">”</w:t>
-      </w:r>
-      <w:r>
-        <w:rPr>
-          <w:rtl/>
-        </w:rPr>
-        <w:t xml:space="preserve"> </w:t>
-      </w:r>
-      <w:r>
-        <w:rPr>
-          <w:rtl/>
-        </w:rPr>
-        <w:t xml:space="preserve">في القرآن؟</w:t>
+        <w:t xml:space="preserve">هل القرآن نزل مرة واحدة أم على مراحل؟</w:t>
       </w:r>
     </w:p>
     <w:tbl>
@@ -2566,7 +2572,7 @@
       </w:tr>
     </w:tbl>
     <w:bookmarkEnd w:id="27"/>
-    <w:bookmarkStart w:id="28" w:name="h07"/>
+    <w:bookmarkStart w:id="28" w:name="r07"/>
     <w:p>
       <w:pPr>
         <w:pStyle w:val="Heading3"/>
@@ -2576,7 +2582,7 @@
         <w:rPr>
           <w:rtl/>
         </w:rPr>
-        <w:t xml:space="preserve">H07</w:t>
+        <w:t xml:space="preserve">R07</w:t>
       </w:r>
     </w:p>
     <w:p>
@@ -2601,7 +2607,7 @@
         <w:rPr>
           <w:rtl/>
         </w:rPr>
-        <w:t xml:space="preserve">هل القرآن نزل مرة واحدة أم على مراحل؟</w:t>
+        <w:t xml:space="preserve">ما المقصود بالنسخ في القرآن؟ وهل يعني أن هناك آيات لم تعد صالحة؟</w:t>
       </w:r>
     </w:p>
     <w:tbl>
@@ -2889,7 +2895,7 @@
       </w:tr>
     </w:tbl>
     <w:bookmarkEnd w:id="28"/>
-    <w:bookmarkStart w:id="29" w:name="h08"/>
+    <w:bookmarkStart w:id="29" w:name="r08"/>
     <w:p>
       <w:pPr>
         <w:pStyle w:val="Heading3"/>
@@ -2899,7 +2905,7 @@
         <w:rPr>
           <w:rtl/>
         </w:rPr>
-        <w:t xml:space="preserve">H08</w:t>
+        <w:t xml:space="preserve">R08</w:t>
       </w:r>
     </w:p>
     <w:p>
@@ -2924,7 +2930,37 @@
         <w:rPr>
           <w:rtl/>
         </w:rPr>
-        <w:t xml:space="preserve">ما المقصود بالنسخ في القرآن؟ وهل يعني أن هناك آيات لم تعد صالحة؟</w:t>
+        <w:t xml:space="preserve">ما المقصود بقوله تعالى:</w:t>
+      </w:r>
+      <w:r>
+        <w:rPr>
+          <w:rtl/>
+        </w:rPr>
+        <w:t xml:space="preserve"> </w:t>
+      </w:r>
+      <w:r>
+        <w:rPr>
+          <w:rtl/>
+        </w:rPr>
+        <w:t xml:space="preserve">“</w:t>
+      </w:r>
+      <w:r>
+        <w:rPr>
+          <w:rtl/>
+        </w:rPr>
+        <w:t xml:space="preserve">اهدِنَا الصِّرَاطَ المُستَقِيمَ</w:t>
+      </w:r>
+      <w:r>
+        <w:rPr>
+          <w:rtl/>
+        </w:rPr>
+        <w:t xml:space="preserve">”</w:t>
+      </w:r>
+      <w:r>
+        <w:rPr>
+          <w:rtl/>
+        </w:rPr>
+        <w:t xml:space="preserve">؟</w:t>
       </w:r>
     </w:p>
     <w:tbl>
@@ -3212,7 +3248,7 @@
       </w:tr>
     </w:tbl>
     <w:bookmarkEnd w:id="29"/>
-    <w:bookmarkStart w:id="30" w:name="h09"/>
+    <w:bookmarkStart w:id="30" w:name="r09-محادثة-من-دورين"/>
     <w:p>
       <w:pPr>
         <w:pStyle w:val="Heading3"/>
@@ -3222,7 +3258,7 @@
         <w:rPr>
           <w:rtl/>
         </w:rPr>
-        <w:t xml:space="preserve">H09</w:t>
+        <w:t xml:space="preserve">R09 (محادثة من دورين)</w:t>
       </w:r>
     </w:p>
     <w:p>
@@ -3235,7 +3271,7 @@
           <w:bCs/>
           <w:b/>
         </w:rPr>
-        <w:t xml:space="preserve">سؤال المستخدم:</w:t>
+        <w:t xml:space="preserve">الدور الأول — سؤال المستخدم:</w:t>
       </w:r>
       <w:r>
         <w:rPr>
@@ -3247,43 +3283,7 @@
         <w:rPr>
           <w:rtl/>
         </w:rPr>
-        <w:t xml:space="preserve">لماذا يستخدم القرآن أحيانًا كلمة</w:t>
-      </w:r>
-      <w:r>
-        <w:rPr>
-          <w:rtl/>
-        </w:rPr>
-        <w:t xml:space="preserve"> </w:t>
-      </w:r>
-      <w:r>
-        <w:rPr>
-          <w:rtl/>
-        </w:rPr>
-        <w:t xml:space="preserve">“</w:t>
-      </w:r>
-      <w:r>
-        <w:rPr>
-          <w:rtl/>
-        </w:rPr>
-        <w:t xml:space="preserve">نحن</w:t>
-      </w:r>
-      <w:r>
-        <w:rPr>
-          <w:rtl/>
-        </w:rPr>
-        <w:t xml:space="preserve">”</w:t>
-      </w:r>
-      <w:r>
-        <w:rPr>
-          <w:rtl/>
-        </w:rPr>
-        <w:t xml:space="preserve"> </w:t>
-      </w:r>
-      <w:r>
-        <w:rPr>
-          <w:rtl/>
-        </w:rPr>
-        <w:t xml:space="preserve">عن الله مع أن الله واحد؟ أليس هذا تناقضًا؟</w:t>
+        <w:t xml:space="preserve">ما أفضل سورة أبدأ بها إذا كنت جديدًا في قراءة القرآن وأريد أن أفهم الفكرة العامة عن الإسلام؟</w:t>
       </w:r>
     </w:p>
     <w:tbl>
@@ -3570,20 +3570,6 @@
         </w:tc>
       </w:tr>
     </w:tbl>
-    <w:bookmarkEnd w:id="30"/>
-    <w:bookmarkStart w:id="31" w:name="h10"/>
-    <w:p>
-      <w:pPr>
-        <w:pStyle w:val="Heading3"/>
-        <w:bidi/>
-      </w:pPr>
-      <w:r>
-        <w:rPr>
-          <w:rtl/>
-        </w:rPr>
-        <w:t xml:space="preserve">H10</w:t>
-      </w:r>
-    </w:p>
     <w:p>
       <w:pPr>
         <w:bidi/>
@@ -3594,7 +3580,7 @@
           <w:bCs/>
           <w:b/>
         </w:rPr>
-        <w:t xml:space="preserve">سؤال المستخدم:</w:t>
+        <w:t xml:space="preserve">الدور الثاني — متابعة المستخدم بعد الدور الأول:</w:t>
       </w:r>
       <w:r>
         <w:rPr>
@@ -3606,7 +3592,7 @@
         <w:rPr>
           <w:rtl/>
         </w:rPr>
-        <w:t xml:space="preserve">قرأت أن بعض الآيات تتكلم عن القتال وبعضها عن السلام، فكيف أفهم هذا من دون أن يبدو القرآن متناقضًا؟</w:t>
+        <w:t xml:space="preserve">هل هناك ترتيب معين للقراءة أو سور قصيرة تنصح أن أقرأها بعدها؟</w:t>
       </w:r>
     </w:p>
     <w:tbl>
@@ -3893,8 +3879,8 @@
         </w:tc>
       </w:tr>
     </w:tbl>
-    <w:bookmarkEnd w:id="31"/>
-    <w:bookmarkStart w:id="32" w:name="h11-محادثة-من-دورين"/>
+    <w:bookmarkEnd w:id="30"/>
+    <w:bookmarkStart w:id="31" w:name="r10-محادثة-من-دورين"/>
     <w:p>
       <w:pPr>
         <w:pStyle w:val="Heading3"/>
@@ -3904,7 +3890,7 @@
         <w:rPr>
           <w:rtl/>
         </w:rPr>
-        <w:t xml:space="preserve">H11 (محادثة من دورين)</w:t>
+        <w:t xml:space="preserve">R10 (محادثة من دورين)</w:t>
       </w:r>
     </w:p>
     <w:p>
@@ -3929,7 +3915,37 @@
         <w:rPr>
           <w:rtl/>
         </w:rPr>
-        <w:t xml:space="preserve">ما أفضل سورة أبدأ بها إذا كنت جديدًا في قراءة القرآن وأريد أن أفهم الفكرة العامة عن الإسلام؟</w:t>
+        <w:t xml:space="preserve">ما معنى</w:t>
+      </w:r>
+      <w:r>
+        <w:rPr>
+          <w:rtl/>
+        </w:rPr>
+        <w:t xml:space="preserve"> </w:t>
+      </w:r>
+      <w:r>
+        <w:rPr>
+          <w:rtl/>
+        </w:rPr>
+        <w:t xml:space="preserve">“</w:t>
+      </w:r>
+      <w:r>
+        <w:rPr>
+          <w:rtl/>
+        </w:rPr>
+        <w:t xml:space="preserve">قل هو الله أحد</w:t>
+      </w:r>
+      <w:r>
+        <w:rPr>
+          <w:rtl/>
+        </w:rPr>
+        <w:t xml:space="preserve">”</w:t>
+      </w:r>
+      <w:r>
+        <w:rPr>
+          <w:rtl/>
+        </w:rPr>
+        <w:t xml:space="preserve">؟</w:t>
       </w:r>
     </w:p>
     <w:tbl>
@@ -4238,7 +4254,37 @@
         <w:rPr>
           <w:rtl/>
         </w:rPr>
-        <w:t xml:space="preserve">هل هناك ترتيب معين للقراءة أو سور قصيرة تنصح أن أقرأها بعدها؟</w:t>
+        <w:t xml:space="preserve">طيب، ماذا تقصد السورة تحديدًا عندما تقول إن الله</w:t>
+      </w:r>
+      <w:r>
+        <w:rPr>
+          <w:rtl/>
+        </w:rPr>
+        <w:t xml:space="preserve"> </w:t>
+      </w:r>
+      <w:r>
+        <w:rPr>
+          <w:rtl/>
+        </w:rPr>
+        <w:t xml:space="preserve">“</w:t>
+      </w:r>
+      <w:r>
+        <w:rPr>
+          <w:rtl/>
+        </w:rPr>
+        <w:t xml:space="preserve">الصمد</w:t>
+      </w:r>
+      <w:r>
+        <w:rPr>
+          <w:rtl/>
+        </w:rPr>
+        <w:t xml:space="preserve">”</w:t>
+      </w:r>
+      <w:r>
+        <w:rPr>
+          <w:rtl/>
+        </w:rPr>
+        <w:t xml:space="preserve">؟</w:t>
       </w:r>
     </w:p>
     <w:tbl>
@@ -4525,8 +4571,8 @@
         </w:tc>
       </w:tr>
     </w:tbl>
-    <w:bookmarkEnd w:id="32"/>
-    <w:bookmarkStart w:id="33" w:name="h12-محادثة-من-دورين"/>
+    <w:bookmarkEnd w:id="31"/>
+    <w:bookmarkStart w:id="32" w:name="r11"/>
     <w:p>
       <w:pPr>
         <w:pStyle w:val="Heading3"/>
@@ -4536,7 +4582,7 @@
         <w:rPr>
           <w:rtl/>
         </w:rPr>
-        <w:t xml:space="preserve">H12 (محادثة من دورين)</w:t>
+        <w:t xml:space="preserve">R11</w:t>
       </w:r>
     </w:p>
     <w:p>
@@ -4549,7 +4595,7 @@
           <w:bCs/>
           <w:b/>
         </w:rPr>
-        <w:t xml:space="preserve">الدور الأول — سؤال المستخدم:</w:t>
+        <w:t xml:space="preserve">سؤال المستخدم:</w:t>
       </w:r>
       <w:r>
         <w:rPr>
@@ -4561,37 +4607,7 @@
         <w:rPr>
           <w:rtl/>
         </w:rPr>
-        <w:t xml:space="preserve">ما معنى</w:t>
-      </w:r>
-      <w:r>
-        <w:rPr>
-          <w:rtl/>
-        </w:rPr>
-        <w:t xml:space="preserve"> </w:t>
-      </w:r>
-      <w:r>
-        <w:rPr>
-          <w:rtl/>
-        </w:rPr>
-        <w:t xml:space="preserve">“</w:t>
-      </w:r>
-      <w:r>
-        <w:rPr>
-          <w:rtl/>
-        </w:rPr>
-        <w:t xml:space="preserve">قل هو الله أحد</w:t>
-      </w:r>
-      <w:r>
-        <w:rPr>
-          <w:rtl/>
-        </w:rPr>
-        <w:t xml:space="preserve">”</w:t>
-      </w:r>
-      <w:r>
-        <w:rPr>
-          <w:rtl/>
-        </w:rPr>
-        <w:t xml:space="preserve">؟</w:t>
+        <w:t xml:space="preserve">أنا مسلم جديد وأحيانًا أشعر أني أقرأ القرآن ولا أفهم شيئًا، وأشعر بالذنب بسبب هذا. كيف أتعامل مع الموضوع؟</w:t>
       </w:r>
     </w:p>
     <w:tbl>
@@ -4878,6 +4894,20 @@
         </w:tc>
       </w:tr>
     </w:tbl>
+    <w:bookmarkEnd w:id="32"/>
+    <w:bookmarkStart w:id="33" w:name="r12"/>
+    <w:p>
+      <w:pPr>
+        <w:pStyle w:val="Heading3"/>
+        <w:bidi/>
+      </w:pPr>
+      <w:r>
+        <w:rPr>
+          <w:rtl/>
+        </w:rPr>
+        <w:t xml:space="preserve">R12</w:t>
+      </w:r>
+    </w:p>
     <w:p>
       <w:pPr>
         <w:bidi/>
@@ -4888,7 +4918,7 @@
           <w:bCs/>
           <w:b/>
         </w:rPr>
-        <w:t xml:space="preserve">الدور الثاني — متابعة المستخدم بعد الدور الأول:</w:t>
+        <w:t xml:space="preserve">سؤال المستخدم:</w:t>
       </w:r>
       <w:r>
         <w:rPr>
@@ -4900,37 +4930,7 @@
         <w:rPr>
           <w:rtl/>
         </w:rPr>
-        <w:t xml:space="preserve">طيب، ماذا تقصد السورة تحديدًا عندما تقول إن الله</w:t>
-      </w:r>
-      <w:r>
-        <w:rPr>
-          <w:rtl/>
-        </w:rPr>
-        <w:t xml:space="preserve"> </w:t>
-      </w:r>
-      <w:r>
-        <w:rPr>
-          <w:rtl/>
-        </w:rPr>
-        <w:t xml:space="preserve">“</w:t>
-      </w:r>
-      <w:r>
-        <w:rPr>
-          <w:rtl/>
-        </w:rPr>
-        <w:t xml:space="preserve">الصمد</w:t>
-      </w:r>
-      <w:r>
-        <w:rPr>
-          <w:rtl/>
-        </w:rPr>
-        <w:t xml:space="preserve">”</w:t>
-      </w:r>
-      <w:r>
-        <w:rPr>
-          <w:rtl/>
-        </w:rPr>
-        <w:t xml:space="preserve">؟</w:t>
+        <w:t xml:space="preserve">ما معنى التقوى في القرآن؟ هل هي مجرد الخوف من الله؟</w:t>
       </w:r>
     </w:p>
     <w:tbl>
@@ -5218,7 +5218,7 @@
       </w:tr>
     </w:tbl>
     <w:bookmarkEnd w:id="33"/>
-    <w:bookmarkStart w:id="34" w:name="h13"/>
+    <w:bookmarkStart w:id="34" w:name="r13"/>
     <w:p>
       <w:pPr>
         <w:pStyle w:val="Heading3"/>
@@ -5228,7 +5228,7 @@
         <w:rPr>
           <w:rtl/>
         </w:rPr>
-        <w:t xml:space="preserve">H13</w:t>
+        <w:t xml:space="preserve">R13</w:t>
       </w:r>
     </w:p>
     <w:p>
@@ -5253,7 +5253,43 @@
         <w:rPr>
           <w:rtl/>
         </w:rPr>
-        <w:t xml:space="preserve">أنا مسلم جديد وأحيانًا أشعر أني أقرأ القرآن ولا أفهم شيئًا، وأشعر بالذنب بسبب هذا. كيف أتعامل مع الموضوع؟</w:t>
+        <w:t xml:space="preserve">لماذا يستخدم القرآن أحيانًا كلمة</w:t>
+      </w:r>
+      <w:r>
+        <w:rPr>
+          <w:rtl/>
+        </w:rPr>
+        <w:t xml:space="preserve"> </w:t>
+      </w:r>
+      <w:r>
+        <w:rPr>
+          <w:rtl/>
+        </w:rPr>
+        <w:t xml:space="preserve">“</w:t>
+      </w:r>
+      <w:r>
+        <w:rPr>
+          <w:rtl/>
+        </w:rPr>
+        <w:t xml:space="preserve">نحن</w:t>
+      </w:r>
+      <w:r>
+        <w:rPr>
+          <w:rtl/>
+        </w:rPr>
+        <w:t xml:space="preserve">”</w:t>
+      </w:r>
+      <w:r>
+        <w:rPr>
+          <w:rtl/>
+        </w:rPr>
+        <w:t xml:space="preserve"> </w:t>
+      </w:r>
+      <w:r>
+        <w:rPr>
+          <w:rtl/>
+        </w:rPr>
+        <w:t xml:space="preserve">عن الله مع أن الله واحد؟ أليس هذا تناقضًا؟</w:t>
       </w:r>
     </w:p>
     <w:tbl>
@@ -5541,7 +5577,7 @@
       </w:tr>
     </w:tbl>
     <w:bookmarkEnd w:id="34"/>
-    <w:bookmarkStart w:id="35" w:name="h14"/>
+    <w:bookmarkStart w:id="35" w:name="r14"/>
     <w:p>
       <w:pPr>
         <w:pStyle w:val="Heading3"/>
@@ -5551,7 +5587,7 @@
         <w:rPr>
           <w:rtl/>
         </w:rPr>
-        <w:t xml:space="preserve">H14</w:t>
+        <w:t xml:space="preserve">R14</w:t>
       </w:r>
     </w:p>
     <w:p>
@@ -5576,7 +5612,7 @@
         <w:rPr>
           <w:rtl/>
         </w:rPr>
-        <w:t xml:space="preserve">هل توجد طريقة للتحقق من صحة حديث يُقال إنه يفسر آية معينة، أم أن هذا موضوع مختلف عن القرآن؟</w:t>
+        <w:t xml:space="preserve">أريد أن أفهم قصة أصحاب الكهف ببساطة: ماذا حدث لهم ولماذا ذكرهم القرآن؟</w:t>
       </w:r>
     </w:p>
     <w:tbl>
@@ -5864,7 +5900,7 @@
       </w:tr>
     </w:tbl>
     <w:bookmarkEnd w:id="35"/>
-    <w:bookmarkStart w:id="36" w:name="h15"/>
+    <w:bookmarkStart w:id="36" w:name="r15"/>
     <w:p>
       <w:pPr>
         <w:pStyle w:val="Heading3"/>
@@ -5874,7 +5910,7 @@
         <w:rPr>
           <w:rtl/>
         </w:rPr>
-        <w:t xml:space="preserve">H15</w:t>
+        <w:t xml:space="preserve">R15</w:t>
       </w:r>
     </w:p>
     <w:p>
@@ -6187,7 +6223,7 @@
       </w:tr>
     </w:tbl>
     <w:bookmarkEnd w:id="36"/>
-    <w:bookmarkStart w:id="37" w:name="hx01"/>
+    <w:bookmarkStart w:id="37" w:name="r16"/>
     <w:p>
       <w:pPr>
         <w:pStyle w:val="Heading3"/>
@@ -6197,7 +6233,7 @@
         <w:rPr>
           <w:rtl/>
         </w:rPr>
-        <w:t xml:space="preserve">HX01</w:t>
+        <w:t xml:space="preserve">R16</w:t>
       </w:r>
     </w:p>
     <w:p>
@@ -6222,7 +6258,7 @@
         <w:rPr>
           <w:rtl/>
         </w:rPr>
-        <w:t xml:space="preserve">لما القرآن يتكلم عن الرحمة، هل المقصود رحمة الله بالإنسان أم رحمة الإنسان بالآخرين؟</w:t>
+        <w:t xml:space="preserve">قرأت أن بعض الآيات تتكلم عن القتال وبعضها عن السلام، فكيف أفهم هذا من دون أن يبدو القرآن متناقضًا؟</w:t>
       </w:r>
     </w:p>
     <w:tbl>
@@ -6510,7 +6546,7 @@
       </w:tr>
     </w:tbl>
     <w:bookmarkEnd w:id="37"/>
-    <w:bookmarkStart w:id="38" w:name="hx02"/>
+    <w:bookmarkStart w:id="38" w:name="r17"/>
     <w:p>
       <w:pPr>
         <w:pStyle w:val="Heading3"/>
@@ -6520,7 +6556,7 @@
         <w:rPr>
           <w:rtl/>
         </w:rPr>
-        <w:t xml:space="preserve">HX02</w:t>
+        <w:t xml:space="preserve">R17</w:t>
       </w:r>
     </w:p>
     <w:p>
@@ -6545,43 +6581,7 @@
         <w:rPr>
           <w:rtl/>
         </w:rPr>
-        <w:t xml:space="preserve">هل الآية التي تقول</w:t>
-      </w:r>
-      <w:r>
-        <w:rPr>
-          <w:rtl/>
-        </w:rPr>
-        <w:t xml:space="preserve"> </w:t>
-      </w:r>
-      <w:r>
-        <w:rPr>
-          <w:rtl/>
-        </w:rPr>
-        <w:t xml:space="preserve">“</w:t>
-      </w:r>
-      <w:r>
-        <w:rPr>
-          <w:rtl/>
-        </w:rPr>
-        <w:t xml:space="preserve">لا إكراه في الدين</w:t>
-      </w:r>
-      <w:r>
-        <w:rPr>
-          <w:rtl/>
-        </w:rPr>
-        <w:t xml:space="preserve">”</w:t>
-      </w:r>
-      <w:r>
-        <w:rPr>
-          <w:rtl/>
-        </w:rPr>
-        <w:t xml:space="preserve"> </w:t>
-      </w:r>
-      <w:r>
-        <w:rPr>
-          <w:rtl/>
-        </w:rPr>
-        <w:t xml:space="preserve">تتكلم عن دخول الإسلام فقط، أم عن التعامل مع غير المسلمين بشكل عام؟</w:t>
+        <w:t xml:space="preserve">ماذا يقول القرآن عن كيفية التعامل مع الوالدين حتى لو كانوا غير مسلمين؟</w:t>
       </w:r>
     </w:p>
     <w:tbl>
@@ -6869,7 +6869,7 @@
       </w:tr>
     </w:tbl>
     <w:bookmarkEnd w:id="38"/>
-    <w:bookmarkStart w:id="39" w:name="hx03"/>
+    <w:bookmarkStart w:id="39" w:name="r18"/>
     <w:p>
       <w:pPr>
         <w:pStyle w:val="Heading3"/>
@@ -6879,7 +6879,7 @@
         <w:rPr>
           <w:rtl/>
         </w:rPr>
-        <w:t xml:space="preserve">HX03</w:t>
+        <w:t xml:space="preserve">R18</w:t>
       </w:r>
     </w:p>
     <w:p>
@@ -6904,7 +6904,7 @@
         <w:rPr>
           <w:rtl/>
         </w:rPr>
-        <w:t xml:space="preserve">أنا أحاول ألتزم بقراءة القرآن يوميًا، لكن فاتتني قراءتي عدة أيام، فهل عليّ شيء شرعًا؟ وكيف أعوضها؟</w:t>
+        <w:t xml:space="preserve">لما القرآن يتكلم عن الرحمة، هل المقصود رحمة الله بالإنسان أم رحمة الإنسان بالآخرين؟</w:t>
       </w:r>
     </w:p>
     <w:tbl>

</xml_diff>